<commit_message>
auto(daily): dev loop report 2026-06-07
</commit_message>
<xml_diff>
--- a/reports/hypothesis/2026-06-07.docx
+++ b/reports/hypothesis/2026-06-07.docx
@@ -15,7 +15,7 @@
         <w:rPr>
           <w:i/>
         </w:rPr>
-        <w:t>생성일: 2026-06-07 09:15 KST  |  표본: 측정소당 최소 2316건 / 총 11755건</w:t>
+        <w:t>생성일: 2026-06-07 13:54 KST  |  표본: 측정소당 최소 2321건 / 총 11780건</w:t>
       </w:r>
     </w:p>
     <w:p>
@@ -143,7 +143,7 @@
           </w:tcPr>
           <w:p>
             <w:r>
-              <w:t>37.614</w:t>
+              <w:t>37.564</w:t>
             </w:r>
           </w:p>
         </w:tc>
@@ -153,7 +153,7 @@
           </w:tcPr>
           <w:p>
             <w:r>
-              <w:t>34.484</w:t>
+              <w:t>34.434</w:t>
             </w:r>
           </w:p>
         </w:tc>
@@ -163,7 +163,7 @@
           </w:tcPr>
           <w:p>
             <w:r>
-              <w:t>+3.130</w:t>
+              <w:t>+3.131</w:t>
             </w:r>
           </w:p>
         </w:tc>
@@ -215,7 +215,7 @@
           </w:tcPr>
           <w:p>
             <w:r>
-              <w:t>20.962</w:t>
+              <w:t>20.931</w:t>
             </w:r>
           </w:p>
         </w:tc>
@@ -225,7 +225,7 @@
           </w:tcPr>
           <w:p>
             <w:r>
-              <w:t>17.700</w:t>
+              <w:t>17.677</w:t>
             </w:r>
           </w:p>
         </w:tc>
@@ -235,7 +235,7 @@
           </w:tcPr>
           <w:p>
             <w:r>
-              <w:t>+3.262</w:t>
+              <w:t>+3.255</w:t>
             </w:r>
           </w:p>
         </w:tc>
@@ -297,7 +297,7 @@
           </w:tcPr>
           <w:p>
             <w:r>
-              <w:t>0.044</w:t>
+              <w:t>0.045</w:t>
             </w:r>
           </w:p>
         </w:tc>
@@ -784,7 +784,7 @@
           </w:tcPr>
           <w:p>
             <w:r>
-              <w:t>12.34</w:t>
+              <w:t>12.24</w:t>
             </w:r>
           </w:p>
         </w:tc>
@@ -846,7 +846,7 @@
           </w:tcPr>
           <w:p>
             <w:r>
-              <w:t>148.49</w:t>
+              <w:t>148.27</w:t>
             </w:r>
           </w:p>
         </w:tc>
@@ -908,7 +908,7 @@
           </w:tcPr>
           <w:p>
             <w:r>
-              <w:t>70.44</w:t>
+              <w:t>70.56</w:t>
             </w:r>
           </w:p>
         </w:tc>
@@ -970,7 +970,7 @@
           </w:tcPr>
           <w:p>
             <w:r>
-              <w:t>149.18</w:t>
+              <w:t>148.99</w:t>
             </w:r>
           </w:p>
         </w:tc>
@@ -1029,7 +1029,7 @@
         <w:pStyle w:val="ListBullet"/>
       </w:pPr>
       <w:r>
-        <w:t>'산단 영향군'가 '베이스라인'보다 평균 3.26 높음 (p=0.0000, 효과크기 작음 d=0.24).</w:t>
+        <w:t>'산단 영향군'가 '베이스라인'보다 평균 3.25 높음 (p=0.0000, 효과크기 작음 d=0.24).</w:t>
       </w:r>
     </w:p>
     <w:p>

</xml_diff>